<commit_message>
docs: update technical docs for week 2; add status report and docx exports
</commit_message>
<xml_diff>
--- a/project_docs/decision_log.docx
+++ b/project_docs/decision_log.docx
@@ -4,17 +4,8 @@
   <w:body>
     <w:p>
       <w:pPr>
-        <w:pStyle w:val="Title"/>
-        <w:spacing w:after="200"/>
-      </w:pPr>
-      <w:r>
-        <w:t xml:space="preserve">Decision Log (Week 1)</w:t>
-      </w:r>
-    </w:p>
-    <w:p>
-      <w:pPr>
         <w:pStyle w:val="Heading1"/>
-        <w:spacing w:after="200"/>
+        <w:spacing w:after="200" w:before="400"/>
       </w:pPr>
       <w:r>
         <w:t xml:space="preserve">Decision Log</w:t>
@@ -23,7 +14,7 @@
     <w:p/>
     <w:p>
       <w:pPr>
-        <w:spacing w:after="120"/>
+        <w:spacing w:after="150"/>
       </w:pPr>
       <w:r>
         <w:t xml:space="preserve">All significant backend technical decisions are recorded here.</w:t>
@@ -31,7 +22,7 @@
     </w:p>
     <w:p>
       <w:pPr>
-        <w:spacing w:after="120"/>
+        <w:spacing w:after="150"/>
       </w:pPr>
       <w:r>
         <w:t xml:space="preserve">Format: decision made, options considered, reasoning, and what might change later.</w:t>
@@ -40,17 +31,17 @@
     <w:p/>
     <w:p>
       <w:pPr>
-        <w:spacing w:after="120"/>
-      </w:pPr>
-      <w:r>
-        <w:t xml:space="preserve">---</w:t>
-      </w:r>
+        <w:pBdr>
+          <w:bottom w:val="single" w:color="auto" w:sz="6" w:space="1"/>
+        </w:pBdr>
+        <w:spacing w:after="200" w:before="200"/>
+      </w:pPr>
     </w:p>
     <w:p/>
     <w:p>
       <w:pPr>
         <w:pStyle w:val="Heading2"/>
-        <w:spacing w:after="200"/>
+        <w:spacing w:after="150" w:before="300"/>
       </w:pPr>
       <w:r>
         <w:t xml:space="preserve">DL-001 — Language: TypeScript over plain JavaScript</w:t>
@@ -59,7 +50,7 @@
     <w:p/>
     <w:p>
       <w:pPr>
-        <w:spacing w:after="120"/>
+        <w:spacing w:after="150"/>
       </w:pPr>
       <w:r>
         <w:t xml:space="preserve">**Date:** 2026-03-23</w:t>
@@ -67,7 +58,7 @@
     </w:p>
     <w:p>
       <w:pPr>
-        <w:spacing w:after="120"/>
+        <w:spacing w:after="150"/>
       </w:pPr>
       <w:r>
         <w:t xml:space="preserve">**Decision:** Use TypeScript throughout</w:t>
@@ -76,7 +67,7 @@
     <w:p/>
     <w:p>
       <w:pPr>
-        <w:spacing w:after="120"/>
+        <w:spacing w:after="150"/>
       </w:pPr>
       <w:r>
         <w:t xml:space="preserve">**Options considered:**</w:t>
@@ -89,7 +80,7 @@
           <w:ilvl w:val="0"/>
           <w:numId w:val="1"/>
         </w:numPr>
-        <w:spacing w:after="60"/>
+        <w:spacing w:after="100"/>
       </w:pPr>
       <w:r>
         <w:t xml:space="preserve">Plain JavaScript — faster to start, no compilation step</w:t>
@@ -102,7 +93,7 @@
           <w:ilvl w:val="0"/>
           <w:numId w:val="1"/>
         </w:numPr>
-        <w:spacing w:after="60"/>
+        <w:spacing w:after="100"/>
       </w:pPr>
       <w:r>
         <w:t xml:space="preserve">TypeScript — type safety, better IDE support, catches bugs at compile time</w:t>
@@ -111,7 +102,7 @@
     <w:p/>
     <w:p>
       <w:pPr>
-        <w:spacing w:after="120"/>
+        <w:spacing w:after="150"/>
       </w:pPr>
       <w:r>
         <w:t xml:space="preserve">**Reasoning:**</w:t>
@@ -119,7 +110,7 @@
     </w:p>
     <w:p>
       <w:pPr>
-        <w:spacing w:after="120"/>
+        <w:spacing w:after="150"/>
       </w:pPr>
       <w:r>
         <w:t xml:space="preserve">ValidDs is a large project with multiple contributors expected over the contract period. TypeScript pays for itself quickly on a codebase this size through autocomplete, interface contracts between layers, and catching shape mismatches between ingestion transformers and DB schemas.</w:t>
@@ -128,7 +119,7 @@
     <w:p/>
     <w:p>
       <w:pPr>
-        <w:spacing w:after="120"/>
+        <w:spacing w:after="150"/>
       </w:pPr>
       <w:r>
         <w:t xml:space="preserve">**What might change:** Nothing. TypeScript stays.</w:t>
@@ -137,17 +128,17 @@
     <w:p/>
     <w:p>
       <w:pPr>
-        <w:spacing w:after="120"/>
-      </w:pPr>
-      <w:r>
-        <w:t xml:space="preserve">---</w:t>
-      </w:r>
+        <w:pBdr>
+          <w:bottom w:val="single" w:color="auto" w:sz="6" w:space="1"/>
+        </w:pBdr>
+        <w:spacing w:after="200" w:before="200"/>
+      </w:pPr>
     </w:p>
     <w:p/>
     <w:p>
       <w:pPr>
         <w:pStyle w:val="Heading2"/>
-        <w:spacing w:after="200"/>
+        <w:spacing w:after="150" w:before="300"/>
       </w:pPr>
       <w:r>
         <w:t xml:space="preserve">DL-002 — Framework: Express over Fastify / NestJS</w:t>
@@ -156,7 +147,7 @@
     <w:p/>
     <w:p>
       <w:pPr>
-        <w:spacing w:after="120"/>
+        <w:spacing w:after="150"/>
       </w:pPr>
       <w:r>
         <w:t xml:space="preserve">**Date:** 2026-03-23</w:t>
@@ -164,7 +155,7 @@
     </w:p>
     <w:p>
       <w:pPr>
-        <w:spacing w:after="120"/>
+        <w:spacing w:after="150"/>
       </w:pPr>
       <w:r>
         <w:t xml:space="preserve">**Decision:** Express</w:t>
@@ -173,7 +164,7 @@
     <w:p/>
     <w:p>
       <w:pPr>
-        <w:spacing w:after="120"/>
+        <w:spacing w:after="150"/>
       </w:pPr>
       <w:r>
         <w:t xml:space="preserve">**Options considered:**</w:t>
@@ -186,7 +177,7 @@
           <w:ilvl w:val="0"/>
           <w:numId w:val="1"/>
         </w:numPr>
-        <w:spacing w:after="60"/>
+        <w:spacing w:after="100"/>
       </w:pPr>
       <w:r>
         <w:t xml:space="preserve">Fastify — faster, built-in schema validation, TypeScript-first</w:t>
@@ -199,7 +190,7 @@
           <w:ilvl w:val="0"/>
           <w:numId w:val="1"/>
         </w:numPr>
-        <w:spacing w:after="60"/>
+        <w:spacing w:after="100"/>
       </w:pPr>
       <w:r>
         <w:t xml:space="preserve">NestJS — opinionated, lots of structure out of the box</w:t>
@@ -212,7 +203,7 @@
           <w:ilvl w:val="0"/>
           <w:numId w:val="1"/>
         </w:numPr>
-        <w:spacing w:after="60"/>
+        <w:spacing w:after="100"/>
       </w:pPr>
       <w:r>
         <w:t xml:space="preserve">Express — minimal, widely known, maximum flexibility</w:t>
@@ -221,7 +212,7 @@
     <w:p/>
     <w:p>
       <w:pPr>
-        <w:spacing w:after="120"/>
+        <w:spacing w:after="150"/>
       </w:pPr>
       <w:r>
         <w:t xml:space="preserve">**Reasoning:**</w:t>
@@ -229,7 +220,7 @@
     </w:p>
     <w:p>
       <w:pPr>
-        <w:spacing w:after="120"/>
+        <w:spacing w:after="150"/>
       </w:pPr>
       <w:r>
         <w:t xml:space="preserve">NestJS would add significant boilerplate and learning curve for a V1 build. Fastify is excellent but less universally familiar. Express is understood by any Node.js engineer who joins — no onboarding friction. Performance difference is irrelevant at V1 scale.</w:t>
@@ -238,7 +229,7 @@
     <w:p/>
     <w:p>
       <w:pPr>
-        <w:spacing w:after="120"/>
+        <w:spacing w:after="150"/>
       </w:pPr>
       <w:r>
         <w:t xml:space="preserve">**What might change:** Could migrate to Fastify if raw throughput becomes a bottleneck. Not expected for V1.</w:t>
@@ -247,17 +238,17 @@
     <w:p/>
     <w:p>
       <w:pPr>
-        <w:spacing w:after="120"/>
-      </w:pPr>
-      <w:r>
-        <w:t xml:space="preserve">---</w:t>
-      </w:r>
+        <w:pBdr>
+          <w:bottom w:val="single" w:color="auto" w:sz="6" w:space="1"/>
+        </w:pBdr>
+        <w:spacing w:after="200" w:before="200"/>
+      </w:pPr>
     </w:p>
     <w:p/>
     <w:p>
       <w:pPr>
         <w:pStyle w:val="Heading2"/>
-        <w:spacing w:after="200"/>
+        <w:spacing w:after="150" w:before="300"/>
       </w:pPr>
       <w:r>
         <w:t xml:space="preserve">DL-003 — Database: MongoDB over PostgreSQL</w:t>
@@ -266,7 +257,7 @@
     <w:p/>
     <w:p>
       <w:pPr>
-        <w:spacing w:after="120"/>
+        <w:spacing w:after="150"/>
       </w:pPr>
       <w:r>
         <w:t xml:space="preserve">**Date:** 2026-03-23</w:t>
@@ -274,7 +265,7 @@
     </w:p>
     <w:p>
       <w:pPr>
-        <w:spacing w:after="120"/>
+        <w:spacing w:after="150"/>
       </w:pPr>
       <w:r>
         <w:t xml:space="preserve">**Decision:** MongoDB (via Mongoose + Atlas)</w:t>
@@ -283,7 +274,7 @@
     <w:p/>
     <w:p>
       <w:pPr>
-        <w:spacing w:after="120"/>
+        <w:spacing w:after="150"/>
       </w:pPr>
       <w:r>
         <w:t xml:space="preserve">**Options considered:**</w:t>
@@ -296,7 +287,7 @@
           <w:ilvl w:val="0"/>
           <w:numId w:val="1"/>
         </w:numPr>
-        <w:spacing w:after="60"/>
+        <w:spacing w:after="100"/>
       </w:pPr>
       <w:r>
         <w:t xml:space="preserve">PostgreSQL (Supabase or Neon free tier) — relational, strict schema, excellent querying</w:t>
@@ -309,7 +300,7 @@
           <w:ilvl w:val="0"/>
           <w:numId w:val="1"/>
         </w:numPr>
-        <w:spacing w:after="60"/>
+        <w:spacing w:after="100"/>
       </w:pPr>
       <w:r>
         <w:t xml:space="preserve">MongoDB (Atlas M0) — document model, flexible schema, free tier</w:t>
@@ -318,7 +309,7 @@
     <w:p/>
     <w:p>
       <w:pPr>
-        <w:spacing w:after="120"/>
+        <w:spacing w:after="150"/>
       </w:pPr>
       <w:r>
         <w:t xml:space="preserve">**Reasoning:**</w:t>
@@ -326,7 +317,7 @@
     </w:p>
     <w:p>
       <w:pPr>
-        <w:spacing w:after="120"/>
+        <w:spacing w:after="150"/>
       </w:pPr>
       <w:r>
         <w:t xml:space="preserve">TikTok product data is schema-heavy in some areas and sparse in others. Products have varying field availability depending on the data source. A document model handles this without constant migrations. Atlas M0 provides a generous free tier. The product feed + detail query patterns map cleanly to MongoDB.</w:t>
@@ -335,7 +326,7 @@
     <w:p/>
     <w:p>
       <w:pPr>
-        <w:spacing w:after="120"/>
+        <w:spacing w:after="150"/>
       </w:pPr>
       <w:r>
         <w:t xml:space="preserve">**What might change:** If complex relational queries become necessary (e.g. multi-table joins for supplier–product relationships), a hybrid approach (MongoDB + Redis for cache + optional Postgres for specific analytics tables) might be considered.</w:t>
@@ -344,26 +335,26 @@
     <w:p/>
     <w:p>
       <w:pPr>
-        <w:spacing w:after="120"/>
-      </w:pPr>
-      <w:r>
-        <w:t xml:space="preserve">---</w:t>
-      </w:r>
+        <w:pBdr>
+          <w:bottom w:val="single" w:color="auto" w:sz="6" w:space="1"/>
+        </w:pBdr>
+        <w:spacing w:after="200" w:before="200"/>
+      </w:pPr>
     </w:p>
     <w:p/>
     <w:p>
       <w:pPr>
         <w:pStyle w:val="Heading2"/>
-        <w:spacing w:after="200"/>
-      </w:pPr>
-      <w:r>
-        <w:t xml:space="preserve">DL-004 — Redis provider: Upstash over self-hosted or Railway</w:t>
-      </w:r>
-    </w:p>
-    <w:p/>
-    <w:p>
-      <w:pPr>
-        <w:spacing w:after="120"/>
+        <w:spacing w:after="150" w:before="300"/>
+      </w:pPr>
+      <w:r>
+        <w:t xml:space="preserve">DL-004 — Redis provider: Managed Redis over self-hosted</w:t>
+      </w:r>
+    </w:p>
+    <w:p/>
+    <w:p>
+      <w:pPr>
+        <w:spacing w:after="150"/>
       </w:pPr>
       <w:r>
         <w:t xml:space="preserve">**Date:** 2026-03-23</w:t>
@@ -371,16 +362,16 @@
     </w:p>
     <w:p>
       <w:pPr>
-        <w:spacing w:after="120"/>
-      </w:pPr>
-      <w:r>
-        <w:t xml:space="preserve">**Decision:** Upstash</w:t>
-      </w:r>
-    </w:p>
-    <w:p/>
-    <w:p>
-      <w:pPr>
-        <w:spacing w:after="120"/>
+        <w:spacing w:after="150"/>
+      </w:pPr>
+      <w:r>
+        <w:t xml:space="preserve">**Decision:** Managed Redis (e.g. Render Managed Redis)</w:t>
+      </w:r>
+    </w:p>
+    <w:p/>
+    <w:p>
+      <w:pPr>
+        <w:spacing w:after="150"/>
       </w:pPr>
       <w:r>
         <w:t xml:space="preserve">**Options considered:**</w:t>
@@ -393,7 +384,7 @@
           <w:ilvl w:val="0"/>
           <w:numId w:val="1"/>
         </w:numPr>
-        <w:spacing w:after="60"/>
+        <w:spacing w:after="100"/>
       </w:pPr>
       <w:r>
         <w:t xml:space="preserve">Self-hosted on Render — requires a separate service, uses Render free tier slot</w:t>
@@ -406,29 +397,16 @@
           <w:ilvl w:val="0"/>
           <w:numId w:val="1"/>
         </w:numPr>
-        <w:spacing w:after="60"/>
-      </w:pPr>
-      <w:r>
-        <w:t xml:space="preserve">Railway Redis — free tier is limited, Railway can be unpredictable</w:t>
-      </w:r>
-    </w:p>
-    <w:p>
-      <w:pPr>
-        <w:pStyle w:val="ListParagraph"/>
-        <w:numPr>
-          <w:ilvl w:val="0"/>
-          <w:numId w:val="1"/>
-        </w:numPr>
-        <w:spacing w:after="60"/>
-      </w:pPr>
-      <w:r>
-        <w:t xml:space="preserve">Upstash — serverless, TLS by default, BullMQ compatible, 10k commands/day free</w:t>
-      </w:r>
-    </w:p>
-    <w:p/>
-    <w:p>
-      <w:pPr>
-        <w:spacing w:after="120"/>
+        <w:spacing w:after="100"/>
+      </w:pPr>
+      <w:r>
+        <w:t xml:space="preserve">Managed Redis — reliable, handled by cloud provider, BullMQ compatible</w:t>
+      </w:r>
+    </w:p>
+    <w:p/>
+    <w:p>
+      <w:pPr>
+        <w:spacing w:after="150"/>
       </w:pPr>
       <w:r>
         <w:t xml:space="preserve">**Reasoning:**</w:t>
@@ -436,35 +414,35 @@
     </w:p>
     <w:p>
       <w:pPr>
-        <w:spacing w:after="120"/>
-      </w:pPr>
-      <w:r>
-        <w:t xml:space="preserve">Upstash requires zero infrastructure management and works over HTTPS/TLS out of the box. The 10k commands/day free tier is sufficient for V1. BullMQ requires a dedicated connection — Upstash handles this fine via `ioredis`.</w:t>
-      </w:r>
-    </w:p>
-    <w:p/>
-    <w:p>
-      <w:pPr>
-        <w:spacing w:after="120"/>
-      </w:pPr>
-      <w:r>
-        <w:t xml:space="preserve">**What might change:** If daily command usage consistently exceeds 10k, upgrade to Upstash pay-as-you-go (~$0.20 per 100k commands).</w:t>
-      </w:r>
-    </w:p>
-    <w:p/>
-    <w:p>
-      <w:pPr>
-        <w:spacing w:after="120"/>
-      </w:pPr>
-      <w:r>
-        <w:t xml:space="preserve">---</w:t>
-      </w:r>
+        <w:spacing w:after="150"/>
+      </w:pPr>
+      <w:r>
+        <w:t xml:space="preserve">Managed Redis requires zero infrastructure management and works over TLS out of the box. BullMQ requires a dedicated connection — managed services handle this fine via `ioredis`.</w:t>
+      </w:r>
+    </w:p>
+    <w:p/>
+    <w:p>
+      <w:pPr>
+        <w:spacing w:after="150"/>
+      </w:pPr>
+      <w:r>
+        <w:t xml:space="preserve">**What might change:** If performance or costs become an issue, we can switch providers by simply updating the `REDIS_URL`.</w:t>
+      </w:r>
+    </w:p>
+    <w:p/>
+    <w:p>
+      <w:pPr>
+        <w:pBdr>
+          <w:bottom w:val="single" w:color="auto" w:sz="6" w:space="1"/>
+        </w:pBdr>
+        <w:spacing w:after="200" w:before="200"/>
+      </w:pPr>
     </w:p>
     <w:p/>
     <w:p>
       <w:pPr>
         <w:pStyle w:val="Heading2"/>
-        <w:spacing w:after="200"/>
+        <w:spacing w:after="150" w:before="300"/>
       </w:pPr>
       <w:r>
         <w:t xml:space="preserve">DL-005 — Deployment: Render over Railway / Fly.io / Heroku</w:t>
@@ -473,7 +451,7 @@
     <w:p/>
     <w:p>
       <w:pPr>
-        <w:spacing w:after="120"/>
+        <w:spacing w:after="150"/>
       </w:pPr>
       <w:r>
         <w:t xml:space="preserve">**Date:** 2026-03-23</w:t>
@@ -481,7 +459,7 @@
     </w:p>
     <w:p>
       <w:pPr>
-        <w:spacing w:after="120"/>
+        <w:spacing w:after="150"/>
       </w:pPr>
       <w:r>
         <w:t xml:space="preserve">**Decision:** Render</w:t>
@@ -490,7 +468,7 @@
     <w:p/>
     <w:p>
       <w:pPr>
-        <w:spacing w:after="120"/>
+        <w:spacing w:after="150"/>
       </w:pPr>
       <w:r>
         <w:t xml:space="preserve">**Options considered:**</w:t>
@@ -503,7 +481,7 @@
           <w:ilvl w:val="0"/>
           <w:numId w:val="1"/>
         </w:numPr>
-        <w:spacing w:after="60"/>
+        <w:spacing w:after="100"/>
       </w:pPr>
       <w:r>
         <w:t xml:space="preserve">Railway — generous free tier, but unpredictable billing</w:t>
@@ -516,7 +494,7 @@
           <w:ilvl w:val="0"/>
           <w:numId w:val="1"/>
         </w:numPr>
-        <w:spacing w:after="60"/>
+        <w:spacing w:after="100"/>
       </w:pPr>
       <w:r>
         <w:t xml:space="preserve">Fly.io — more powerful but more complex to configure</w:t>
@@ -529,7 +507,7 @@
           <w:ilvl w:val="0"/>
           <w:numId w:val="1"/>
         </w:numPr>
-        <w:spacing w:after="60"/>
+        <w:spacing w:after="100"/>
       </w:pPr>
       <w:r>
         <w:t xml:space="preserve">Heroku — no longer has a meaningful free tier</w:t>
@@ -542,7 +520,7 @@
           <w:ilvl w:val="0"/>
           <w:numId w:val="1"/>
         </w:numPr>
-        <w:spacing w:after="60"/>
+        <w:spacing w:after="100"/>
       </w:pPr>
       <w:r>
         <w:t xml:space="preserve">Render — simple, GitHub integration, health checks, free tier</w:t>
@@ -551,7 +529,7 @@
     <w:p/>
     <w:p>
       <w:pPr>
-        <w:spacing w:after="120"/>
+        <w:spacing w:after="150"/>
       </w:pPr>
       <w:r>
         <w:t xml:space="preserve">**Reasoning:**</w:t>
@@ -559,7 +537,7 @@
     </w:p>
     <w:p>
       <w:pPr>
-        <w:spacing w:after="120"/>
+        <w:spacing w:after="150"/>
       </w:pPr>
       <w:r>
         <w:t xml:space="preserve">Render free tier deploys immediately from GitHub, supports health checks natively, and has clear upgrade paths. The sleep-after-inactivity behaviour on free tier is acceptable for a test deployment.</w:t>
@@ -568,7 +546,7 @@
     <w:p/>
     <w:p>
       <w:pPr>
-        <w:spacing w:after="120"/>
+        <w:spacing w:after="150"/>
       </w:pPr>
       <w:r>
         <w:t xml:space="preserve">**What might change:** Upgrade to Render Starter ($7/month) when always-on is needed for a real demo or user testing.</w:t>
@@ -577,17 +555,17 @@
     <w:p/>
     <w:p>
       <w:pPr>
-        <w:spacing w:after="120"/>
-      </w:pPr>
-      <w:r>
-        <w:t xml:space="preserve">---</w:t>
-      </w:r>
+        <w:pBdr>
+          <w:bottom w:val="single" w:color="auto" w:sz="6" w:space="1"/>
+        </w:pBdr>
+        <w:spacing w:after="200" w:before="200"/>
+      </w:pPr>
     </w:p>
     <w:p/>
     <w:p>
       <w:pPr>
         <w:pStyle w:val="Heading2"/>
-        <w:spacing w:after="200"/>
+        <w:spacing w:after="150" w:before="300"/>
       </w:pPr>
       <w:r>
         <w:t xml:space="preserve">DL-006 — Logger: Custom over Pino / Winston</w:t>
@@ -596,7 +574,7 @@
     <w:p/>
     <w:p>
       <w:pPr>
-        <w:spacing w:after="120"/>
+        <w:spacing w:after="150"/>
       </w:pPr>
       <w:r>
         <w:t xml:space="preserve">**Date:** 2026-03-23</w:t>
@@ -604,7 +582,7 @@
     </w:p>
     <w:p>
       <w:pPr>
-        <w:spacing w:after="120"/>
+        <w:spacing w:after="150"/>
       </w:pPr>
       <w:r>
         <w:t xml:space="preserve">**Decision:** Custom logger</w:t>
@@ -613,7 +591,7 @@
     <w:p/>
     <w:p>
       <w:pPr>
-        <w:spacing w:after="120"/>
+        <w:spacing w:after="150"/>
       </w:pPr>
       <w:r>
         <w:t xml:space="preserve">**Options considered:**</w:t>
@@ -626,7 +604,7 @@
           <w:ilvl w:val="0"/>
           <w:numId w:val="1"/>
         </w:numPr>
-        <w:spacing w:after="60"/>
+        <w:spacing w:after="100"/>
       </w:pPr>
       <w:r>
         <w:t xml:space="preserve">Pino — very fast, structured JSON, excellent ecosystem</w:t>
@@ -639,7 +617,7 @@
           <w:ilvl w:val="0"/>
           <w:numId w:val="1"/>
         </w:numPr>
-        <w:spacing w:after="60"/>
+        <w:spacing w:after="100"/>
       </w:pPr>
       <w:r>
         <w:t xml:space="preserve">Winston — highly configurable, well-known</w:t>
@@ -652,7 +630,7 @@
           <w:ilvl w:val="0"/>
           <w:numId w:val="1"/>
         </w:numPr>
-        <w:spacing w:after="60"/>
+        <w:spacing w:after="100"/>
       </w:pPr>
       <w:r>
         <w:t xml:space="preserve">Custom — zero dependencies, full control, purpose-built for this project</w:t>
@@ -661,7 +639,7 @@
     <w:p/>
     <w:p>
       <w:pPr>
-        <w:spacing w:after="120"/>
+        <w:spacing w:after="150"/>
       </w:pPr>
       <w:r>
         <w:t xml:space="preserve">**Reasoning:**</w:t>
@@ -669,7 +647,7 @@
     </w:p>
     <w:p>
       <w:pPr>
-        <w:spacing w:after="120"/>
+        <w:spacing w:after="150"/>
       </w:pPr>
       <w:r>
         <w:t xml:space="preserve">Pino is excellent but adds a dependency and its configuration is non-trivial to get right in production. Winston is heavier than needed. For a project this size, a custom logger with AsyncLocalStorage context, JSON/pretty formatters, and pluggable transports is straightforward to build and gives full control — which was explicitly requested.</w:t>
@@ -678,7 +656,7 @@
     <w:p/>
     <w:p>
       <w:pPr>
-        <w:spacing w:after="120"/>
+        <w:spacing w:after="150"/>
       </w:pPr>
       <w:r>
         <w:t xml:space="preserve">**What might change:** If log volume becomes very high and performance matters, revisit Pino.</w:t>
@@ -687,17 +665,17 @@
     <w:p/>
     <w:p>
       <w:pPr>
-        <w:spacing w:after="120"/>
-      </w:pPr>
-      <w:r>
-        <w:t xml:space="preserve">---</w:t>
-      </w:r>
+        <w:pBdr>
+          <w:bottom w:val="single" w:color="auto" w:sz="6" w:space="1"/>
+        </w:pBdr>
+        <w:spacing w:after="200" w:before="200"/>
+      </w:pPr>
     </w:p>
     <w:p/>
     <w:p>
       <w:pPr>
         <w:pStyle w:val="Heading2"/>
-        <w:spacing w:after="200"/>
+        <w:spacing w:after="150" w:before="300"/>
       </w:pPr>
       <w:r>
         <w:t xml:space="preserve">DL-007 — Encryption: AES-256-GCM over AES-256-CBC</w:t>
@@ -706,7 +684,7 @@
     <w:p/>
     <w:p>
       <w:pPr>
-        <w:spacing w:after="120"/>
+        <w:spacing w:after="150"/>
       </w:pPr>
       <w:r>
         <w:t xml:space="preserve">**Date:** 2026-03-23</w:t>
@@ -714,7 +692,7 @@
     </w:p>
     <w:p>
       <w:pPr>
-        <w:spacing w:after="120"/>
+        <w:spacing w:after="150"/>
       </w:pPr>
       <w:r>
         <w:t xml:space="preserve">**Decision:** AES-256-GCM for field-level encryption</w:t>
@@ -723,7 +701,7 @@
     <w:p/>
     <w:p>
       <w:pPr>
-        <w:spacing w:after="120"/>
+        <w:spacing w:after="150"/>
       </w:pPr>
       <w:r>
         <w:t xml:space="preserve">**Reasoning:**</w:t>
@@ -731,7 +709,7 @@
     </w:p>
     <w:p>
       <w:pPr>
-        <w:spacing w:after="120"/>
+        <w:spacing w:after="150"/>
       </w:pPr>
       <w:r>
         <w:t xml:space="preserve">GCM mode provides authenticated encryption — it both encrypts and verifies data integrity with a single operation. CBC mode requires a separate HMAC for integrity verification. GCM is the modern standard for field-level encryption. No external library needed — Node's built-in `crypto` module handles it.</w:t>
@@ -740,17 +718,17 @@
     <w:p/>
     <w:p>
       <w:pPr>
-        <w:spacing w:after="120"/>
-      </w:pPr>
-      <w:r>
-        <w:t xml:space="preserve">---</w:t>
-      </w:r>
+        <w:pBdr>
+          <w:bottom w:val="single" w:color="auto" w:sz="6" w:space="1"/>
+        </w:pBdr>
+        <w:spacing w:after="200" w:before="200"/>
+      </w:pPr>
     </w:p>
     <w:p/>
     <w:p>
       <w:pPr>
         <w:pStyle w:val="Heading2"/>
-        <w:spacing w:after="200"/>
+        <w:spacing w:after="150" w:before="300"/>
       </w:pPr>
       <w:r>
         <w:t xml:space="preserve">DL-008 — JWT: Custom HS256 over jsonwebtoken library</w:t>
@@ -759,7 +737,7 @@
     <w:p/>
     <w:p>
       <w:pPr>
-        <w:spacing w:after="120"/>
+        <w:spacing w:after="150"/>
       </w:pPr>
       <w:r>
         <w:t xml:space="preserve">**Date:** 2026-03-23</w:t>
@@ -767,7 +745,7 @@
     </w:p>
     <w:p>
       <w:pPr>
-        <w:spacing w:after="120"/>
+        <w:spacing w:after="150"/>
       </w:pPr>
       <w:r>
         <w:t xml:space="preserve">**Decision:** Custom JWT implementation</w:t>
@@ -776,7 +754,7 @@
     <w:p/>
     <w:p>
       <w:pPr>
-        <w:spacing w:after="120"/>
+        <w:spacing w:after="150"/>
       </w:pPr>
       <w:r>
         <w:t xml:space="preserve">**Reasoning:**</w:t>
@@ -784,7 +762,7 @@
     </w:p>
     <w:p>
       <w:pPr>
-        <w:spacing w:after="120"/>
+        <w:spacing w:after="150"/>
       </w:pPr>
       <w:r>
         <w:t xml:space="preserve">The `jsonwebtoken` npm package is 3+ years without a major update and has had historical vulnerabilities. HS256 JWTs are straightforward to implement with Node's built-in `crypto`. The custom implementation is ~60 lines, fully understood, and has no supply chain risk.</w:t>
@@ -793,7 +771,7 @@
     <w:p/>
     <w:p>
       <w:pPr>
-        <w:spacing w:after="120"/>
+        <w:spacing w:after="150"/>
       </w:pPr>
       <w:r>
         <w:t xml:space="preserve">**What might change:** If asymmetric keys (RS256) become necessary (e.g. multi-service auth), switch to `jose` or `fast-jwt`.</w:t>
@@ -802,17 +780,17 @@
     <w:p/>
     <w:p>
       <w:pPr>
-        <w:spacing w:after="120"/>
-      </w:pPr>
-      <w:r>
-        <w:t xml:space="preserve">---</w:t>
-      </w:r>
+        <w:pBdr>
+          <w:bottom w:val="single" w:color="auto" w:sz="6" w:space="1"/>
+        </w:pBdr>
+        <w:spacing w:after="200" w:before="200"/>
+      </w:pPr>
     </w:p>
     <w:p/>
     <w:p>
       <w:pPr>
         <w:pStyle w:val="Heading2"/>
-        <w:spacing w:after="200"/>
+        <w:spacing w:after="150" w:before="300"/>
       </w:pPr>
       <w:r>
         <w:t xml:space="preserve">DL-009 — Ingestion: Orchestrator pattern with explicit fallbacks</w:t>
@@ -821,7 +799,7 @@
     <w:p/>
     <w:p>
       <w:pPr>
-        <w:spacing w:after="120"/>
+        <w:spacing w:after="150"/>
       </w:pPr>
       <w:r>
         <w:t xml:space="preserve">**Date:** 2026-03-23</w:t>
@@ -829,7 +807,7 @@
     </w:p>
     <w:p>
       <w:pPr>
-        <w:spacing w:after="120"/>
+        <w:spacing w:after="150"/>
       </w:pPr>
       <w:r>
         <w:t xml:space="preserve">**Decision:** Separate source modules + orchestrator that manages fallback switching</w:t>
@@ -838,7 +816,7 @@
     <w:p/>
     <w:p>
       <w:pPr>
-        <w:spacing w:after="120"/>
+        <w:spacing w:after="150"/>
       </w:pPr>
       <w:r>
         <w:t xml:space="preserve">**Reasoning:**</w:t>
@@ -846,7 +824,7 @@
     </w:p>
     <w:p>
       <w:pPr>
-        <w:spacing w:after="120"/>
+        <w:spacing w:after="150"/>
       </w:pPr>
       <w:r>
         <w:t xml:space="preserve">TikTok data acquisition is the highest-risk component of the system. A single source that breaks takes down the whole product. The orchestrator pattern means: primary fails → fallback A → fallback B → alert, without any manual intervention. Each source is independently testable. New sources can be added without touching the orchestrator logic.</w:t>
@@ -855,7 +833,7 @@
     <w:p/>
     <w:p>
       <w:pPr>
-        <w:spacing w:after="120"/>
+        <w:spacing w:after="150"/>
       </w:pPr>
       <w:r>
         <w:t xml:space="preserve">**What might change:** Sources will be confirmed and filled in during Week 1–2 of the engagement.</w:t>
@@ -864,17 +842,17 @@
     <w:p/>
     <w:p>
       <w:pPr>
-        <w:spacing w:after="120"/>
-      </w:pPr>
-      <w:r>
-        <w:t xml:space="preserve">---</w:t>
-      </w:r>
+        <w:pBdr>
+          <w:bottom w:val="single" w:color="auto" w:sz="6" w:space="1"/>
+        </w:pBdr>
+        <w:spacing w:after="200" w:before="200"/>
+      </w:pPr>
     </w:p>
     <w:p/>
     <w:p>
       <w:pPr>
         <w:pStyle w:val="Heading2"/>
-        <w:spacing w:after="200"/>
+        <w:spacing w:after="150" w:before="300"/>
       </w:pPr>
       <w:r>
         <w:t xml:space="preserve">DL-010 — Auth: Email-first registration with verification code</w:t>
@@ -883,7 +861,7 @@
     <w:p/>
     <w:p>
       <w:pPr>
-        <w:spacing w:after="120"/>
+        <w:spacing w:after="150"/>
       </w:pPr>
       <w:r>
         <w:t xml:space="preserve">**Date:** 2026-03-27</w:t>
@@ -891,7 +869,7 @@
     </w:p>
     <w:p>
       <w:pPr>
-        <w:spacing w:after="120"/>
+        <w:spacing w:after="150"/>
       </w:pPr>
       <w:r>
         <w:t xml:space="preserve">**Decision:** Registration starts with email only. The backend sends a one-time verification code. The user completes registration by submitting code + password.</w:t>
@@ -900,7 +878,7 @@
     <w:p/>
     <w:p>
       <w:pPr>
-        <w:spacing w:after="120"/>
+        <w:spacing w:after="150"/>
       </w:pPr>
       <w:r>
         <w:t xml:space="preserve">**Reasoning:**</w:t>
@@ -913,7 +891,7 @@
           <w:ilvl w:val="0"/>
           <w:numId w:val="1"/>
         </w:numPr>
-        <w:spacing w:after="60"/>
+        <w:spacing w:after="100"/>
       </w:pPr>
       <w:r>
         <w:t xml:space="preserve">Prevents account creation with typos (email must be reachable)</w:t>
@@ -926,7 +904,7 @@
           <w:ilvl w:val="0"/>
           <w:numId w:val="1"/>
         </w:numPr>
-        <w:spacing w:after="60"/>
+        <w:spacing w:after="100"/>
       </w:pPr>
       <w:r>
         <w:t xml:space="preserve">Improves security by proving email ownership before enabling password login</w:t>
@@ -939,7 +917,7 @@
           <w:ilvl w:val="0"/>
           <w:numId w:val="1"/>
         </w:numPr>
-        <w:spacing w:after="60"/>
+        <w:spacing w:after="100"/>
       </w:pPr>
       <w:r>
         <w:t xml:space="preserve">Fits the product onboarding flow (minimal friction up front)</w:t>
@@ -948,17 +926,17 @@
     <w:p/>
     <w:p>
       <w:pPr>
-        <w:spacing w:after="120"/>
-      </w:pPr>
-      <w:r>
-        <w:t xml:space="preserve">---</w:t>
-      </w:r>
+        <w:pBdr>
+          <w:bottom w:val="single" w:color="auto" w:sz="6" w:space="1"/>
+        </w:pBdr>
+        <w:spacing w:after="200" w:before="200"/>
+      </w:pPr>
     </w:p>
     <w:p/>
     <w:p>
       <w:pPr>
         <w:pStyle w:val="Heading2"/>
-        <w:spacing w:after="200"/>
+        <w:spacing w:after="150" w:before="300"/>
       </w:pPr>
       <w:r>
         <w:t xml:space="preserve">DL-011 — Social auth: Google ID token + TikTok OAuth code exchange</w:t>
@@ -967,7 +945,7 @@
     <w:p/>
     <w:p>
       <w:pPr>
-        <w:spacing w:after="120"/>
+        <w:spacing w:after="150"/>
       </w:pPr>
       <w:r>
         <w:t xml:space="preserve">**Date:** 2026-03-27</w:t>
@@ -975,7 +953,7 @@
     </w:p>
     <w:p>
       <w:pPr>
-        <w:spacing w:after="120"/>
+        <w:spacing w:after="150"/>
       </w:pPr>
       <w:r>
         <w:t xml:space="preserve">**Decision:** Support Google sign-in via ID token verification and TikTok sign-in via OAuth code exchange + user info lookup.</w:t>
@@ -984,7 +962,7 @@
     <w:p/>
     <w:p>
       <w:pPr>
-        <w:spacing w:after="120"/>
+        <w:spacing w:after="150"/>
       </w:pPr>
       <w:r>
         <w:t xml:space="preserve">**Reasoning:**</w:t>
@@ -997,7 +975,7 @@
           <w:ilvl w:val="0"/>
           <w:numId w:val="1"/>
         </w:numPr>
-        <w:spacing w:after="60"/>
+        <w:spacing w:after="100"/>
       </w:pPr>
       <w:r>
         <w:t xml:space="preserve">Google: frontend can obtain an ID token and exchange it directly with the API for a session</w:t>
@@ -1010,10 +988,169 @@
           <w:ilvl w:val="0"/>
           <w:numId w:val="1"/>
         </w:numPr>
-        <w:spacing w:after="60"/>
+        <w:spacing w:after="100"/>
       </w:pPr>
       <w:r>
         <w:t xml:space="preserve">TikTok: OAuth code exchange is the standard flow to obtain access token and fetch user profile</w:t>
+      </w:r>
+    </w:p>
+    <w:p/>
+    <w:p>
+      <w:pPr>
+        <w:pBdr>
+          <w:bottom w:val="single" w:color="auto" w:sz="6" w:space="1"/>
+        </w:pBdr>
+        <w:spacing w:after="200" w:before="200"/>
+      </w:pPr>
+    </w:p>
+    <w:p/>
+    <w:p>
+      <w:pPr>
+        <w:pStyle w:val="Heading2"/>
+        <w:spacing w:after="150" w:before="300"/>
+      </w:pPr>
+      <w:r>
+        <w:t xml:space="preserve">DL-012 — Redis infrastructure: Generalizing for any provider</w:t>
+      </w:r>
+    </w:p>
+    <w:p/>
+    <w:p>
+      <w:pPr>
+        <w:spacing w:after="150"/>
+      </w:pPr>
+      <w:r>
+        <w:t xml:space="preserve">**Date:** 2026-04-02</w:t>
+      </w:r>
+    </w:p>
+    <w:p>
+      <w:pPr>
+        <w:spacing w:after="150"/>
+      </w:pPr>
+      <w:r>
+        <w:t xml:space="preserve">**Decision:** Generalize the Redis client to support any Redis provider via standard URL and TLS configurations.</w:t>
+      </w:r>
+    </w:p>
+    <w:p/>
+    <w:p>
+      <w:pPr>
+        <w:spacing w:after="150"/>
+      </w:pPr>
+      <w:r>
+        <w:t xml:space="preserve">**Reasoning:**</w:t>
+      </w:r>
+    </w:p>
+    <w:p>
+      <w:pPr>
+        <w:spacing w:after="150"/>
+      </w:pPr>
+      <w:r>
+        <w:t xml:space="preserve">Relying solely on Upstash or any specific provider introduces vendor lock-in. By using a standard `ioredis` configuration that supports generic `REDIS_URL` and `REDIS_TLS` toggles, the backend can easily switch between Render Managed Redis, Upstash, or a self-hosted instance without code changes.</w:t>
+      </w:r>
+    </w:p>
+    <w:p/>
+    <w:p>
+      <w:pPr>
+        <w:pBdr>
+          <w:bottom w:val="single" w:color="auto" w:sz="6" w:space="1"/>
+        </w:pBdr>
+        <w:spacing w:after="200" w:before="200"/>
+      </w:pPr>
+    </w:p>
+    <w:p/>
+    <w:p>
+      <w:pPr>
+        <w:pStyle w:val="Heading2"/>
+        <w:spacing w:after="150" w:before="300"/>
+      </w:pPr>
+      <w:r>
+        <w:t xml:space="preserve">DL-013 — Observability: Prometheus Remote Write to Grafana Cloud</w:t>
+      </w:r>
+    </w:p>
+    <w:p/>
+    <w:p>
+      <w:pPr>
+        <w:spacing w:after="150"/>
+      </w:pPr>
+      <w:r>
+        <w:t xml:space="preserve">**Date:** 2026-04-03</w:t>
+      </w:r>
+    </w:p>
+    <w:p>
+      <w:pPr>
+        <w:spacing w:after="150"/>
+      </w:pPr>
+      <w:r>
+        <w:t xml:space="preserve">**Decision:** Implement Prometheus Remote Write to export metrics directly to Grafana Cloud.</w:t>
+      </w:r>
+    </w:p>
+    <w:p/>
+    <w:p>
+      <w:pPr>
+        <w:spacing w:after="150"/>
+      </w:pPr>
+      <w:r>
+        <w:t xml:space="preserve">**Reasoning:**</w:t>
+      </w:r>
+    </w:p>
+    <w:p>
+      <w:pPr>
+        <w:spacing w:after="150"/>
+      </w:pPr>
+      <w:r>
+        <w:t xml:space="preserve">Render services can be restarted or moved, which would lead to loss of local Prometheus metrics if only the `/metrics` endpoint is used. Remote Write ensures that metrics are pushed to a persistent cloud store (Grafana Cloud) in real-time, providing reliable long-term observability and dashboarding.</w:t>
+      </w:r>
+    </w:p>
+    <w:p/>
+    <w:p>
+      <w:pPr>
+        <w:pBdr>
+          <w:bottom w:val="single" w:color="auto" w:sz="6" w:space="1"/>
+        </w:pBdr>
+        <w:spacing w:after="200" w:before="200"/>
+      </w:pPr>
+    </w:p>
+    <w:p/>
+    <w:p>
+      <w:pPr>
+        <w:pStyle w:val="Heading2"/>
+        <w:spacing w:after="150" w:before="300"/>
+      </w:pPr>
+      <w:r>
+        <w:t xml:space="preserve">DL-014 — Documentation: Modular OpenAPI 3.0 Structure</w:t>
+      </w:r>
+    </w:p>
+    <w:p/>
+    <w:p>
+      <w:pPr>
+        <w:spacing w:after="150"/>
+      </w:pPr>
+      <w:r>
+        <w:t xml:space="preserve">**Date:** 2026-04-01</w:t>
+      </w:r>
+    </w:p>
+    <w:p>
+      <w:pPr>
+        <w:spacing w:after="150"/>
+      </w:pPr>
+      <w:r>
+        <w:t xml:space="preserve">**Decision:** Move from monolithic Swagger descriptions to a modular directory-based structure.</w:t>
+      </w:r>
+    </w:p>
+    <w:p/>
+    <w:p>
+      <w:pPr>
+        <w:spacing w:after="150"/>
+      </w:pPr>
+      <w:r>
+        <w:t xml:space="preserve">**Reasoning:**</w:t>
+      </w:r>
+    </w:p>
+    <w:p>
+      <w:pPr>
+        <w:spacing w:after="150"/>
+      </w:pPr>
+      <w:r>
+        <w:t xml:space="preserve">As the API grows (Auth, Profile, Products, Ingestion), a single `swagger.yaml` becomes unreadable and prone to merge conflicts. Splitting definitions into per-module files (`auth.yaml`, `products.yaml`) makes the documentation easier to maintain and review.</w:t>
       </w:r>
     </w:p>
     <w:p/>

</xml_diff>